<commit_message>
D-16, question editing done!
</commit_message>
<xml_diff>
--- a/Received/1/1, grammar.docx
+++ b/Received/1/1, grammar.docx
@@ -770,7 +770,27 @@
           <w:sz w:val="32"/>
           <w:szCs w:val="32"/>
         </w:rPr>
-        <w:t>N.1, Change singular noun into plural.</w:t>
+        <w:t>N.1</w:t>
+      </w:r>
+      <w:r>
+        <w:rPr>
+          <w:rFonts w:ascii="Times New Roman" w:hAnsi="Times New Roman" w:cs="Times New Roman"/>
+          <w:b/>
+          <w:bCs/>
+          <w:sz w:val="32"/>
+          <w:szCs w:val="32"/>
+        </w:rPr>
+        <w:t>.</w:t>
+      </w:r>
+      <w:r>
+        <w:rPr>
+          <w:rFonts w:ascii="Times New Roman" w:hAnsi="Times New Roman" w:cs="Times New Roman"/>
+          <w:b/>
+          <w:bCs/>
+          <w:sz w:val="32"/>
+          <w:szCs w:val="32"/>
+        </w:rPr>
+        <w:t xml:space="preserve"> Change singular noun into plural.</w:t>
       </w:r>
       <w:r>
         <w:rPr>
@@ -1034,57 +1054,47 @@
           <w:sz w:val="32"/>
           <w:szCs w:val="32"/>
         </w:rPr>
-        <w:t>Q.N. 2, Re-arrange the words.</w:t>
-      </w:r>
-      <w:r>
-        <w:rPr>
-          <w:rFonts w:ascii="Times New Roman" w:hAnsi="Times New Roman" w:cs="Times New Roman"/>
-          <w:b/>
-          <w:bCs/>
-          <w:sz w:val="32"/>
-          <w:szCs w:val="32"/>
-        </w:rPr>
-        <w:tab/>
-      </w:r>
-      <w:r>
-        <w:rPr>
-          <w:rFonts w:ascii="Times New Roman" w:hAnsi="Times New Roman" w:cs="Times New Roman"/>
-          <w:b/>
-          <w:bCs/>
-          <w:sz w:val="32"/>
-          <w:szCs w:val="32"/>
-        </w:rPr>
-        <w:tab/>
-      </w:r>
-      <w:r>
-        <w:rPr>
-          <w:rFonts w:ascii="Times New Roman" w:hAnsi="Times New Roman" w:cs="Times New Roman"/>
-          <w:b/>
-          <w:bCs/>
-          <w:sz w:val="32"/>
-          <w:szCs w:val="32"/>
-        </w:rPr>
-        <w:tab/>
-      </w:r>
-      <w:r>
-        <w:rPr>
-          <w:rFonts w:ascii="Times New Roman" w:hAnsi="Times New Roman" w:cs="Times New Roman"/>
-          <w:b/>
-          <w:bCs/>
-          <w:sz w:val="32"/>
-          <w:szCs w:val="32"/>
-        </w:rPr>
-        <w:tab/>
-      </w:r>
-      <w:r>
-        <w:rPr>
-          <w:rFonts w:ascii="Times New Roman" w:hAnsi="Times New Roman" w:cs="Times New Roman"/>
-          <w:b/>
-          <w:bCs/>
-          <w:sz w:val="32"/>
-          <w:szCs w:val="32"/>
-        </w:rPr>
-        <w:tab/>
+        <w:t>Q.N. 2</w:t>
+      </w:r>
+      <w:r>
+        <w:rPr>
+          <w:rFonts w:ascii="Times New Roman" w:hAnsi="Times New Roman" w:cs="Times New Roman"/>
+          <w:b/>
+          <w:bCs/>
+          <w:sz w:val="32"/>
+          <w:szCs w:val="32"/>
+        </w:rPr>
+        <w:t>.</w:t>
+      </w:r>
+      <w:r>
+        <w:rPr>
+          <w:rFonts w:ascii="Times New Roman" w:hAnsi="Times New Roman" w:cs="Times New Roman"/>
+          <w:b/>
+          <w:bCs/>
+          <w:sz w:val="32"/>
+          <w:szCs w:val="32"/>
+        </w:rPr>
+        <w:t xml:space="preserve"> Re-arrange the</w:t>
+      </w:r>
+      <w:r>
+        <w:rPr>
+          <w:rFonts w:ascii="Times New Roman" w:hAnsi="Times New Roman" w:cs="Times New Roman"/>
+          <w:b/>
+          <w:bCs/>
+          <w:sz w:val="32"/>
+          <w:szCs w:val="32"/>
+        </w:rPr>
+        <w:t xml:space="preserve"> letters to make meaningful word</w:t>
+      </w:r>
+      <w:r>
+        <w:rPr>
+          <w:rFonts w:ascii="Times New Roman" w:hAnsi="Times New Roman" w:cs="Times New Roman"/>
+          <w:b/>
+          <w:bCs/>
+          <w:sz w:val="32"/>
+          <w:szCs w:val="32"/>
+        </w:rPr>
+        <w:t>.</w:t>
       </w:r>
       <w:r>
         <w:rPr>
@@ -1324,7 +1334,27 @@
           <w:sz w:val="32"/>
           <w:szCs w:val="32"/>
         </w:rPr>
-        <w:t>Q.N.3 Use '</w:t>
+        <w:t>Q.N.</w:t>
+      </w:r>
+      <w:r>
+        <w:rPr>
+          <w:rFonts w:ascii="Times New Roman" w:hAnsi="Times New Roman" w:cs="Times New Roman"/>
+          <w:b/>
+          <w:bCs/>
+          <w:sz w:val="32"/>
+          <w:szCs w:val="32"/>
+        </w:rPr>
+        <w:t xml:space="preserve"> </w:t>
+      </w:r>
+      <w:r>
+        <w:rPr>
+          <w:rFonts w:ascii="Times New Roman" w:hAnsi="Times New Roman" w:cs="Times New Roman"/>
+          <w:b/>
+          <w:bCs/>
+          <w:sz w:val="32"/>
+          <w:szCs w:val="32"/>
+        </w:rPr>
+        <w:t>3 Use '</w:t>
       </w:r>
       <w:proofErr w:type="spellStart"/>
       <w:r>
@@ -1456,16 +1486,6 @@
           <w:sz w:val="32"/>
           <w:szCs w:val="32"/>
         </w:rPr>
-        <w:tab/>
-      </w:r>
-      <w:r>
-        <w:rPr>
-          <w:rFonts w:ascii="Times New Roman" w:hAnsi="Times New Roman" w:cs="Times New Roman"/>
-          <w:b/>
-          <w:bCs/>
-          <w:sz w:val="32"/>
-          <w:szCs w:val="32"/>
-        </w:rPr>
         <w:t>3</w:t>
       </w:r>
     </w:p>
@@ -1634,7 +1654,107 @@
           <w:sz w:val="32"/>
           <w:szCs w:val="32"/>
         </w:rPr>
-        <w:t>Q.N. 4, Use (have) or (has).</w:t>
+        <w:t>Q.N. 4</w:t>
+      </w:r>
+      <w:r>
+        <w:rPr>
+          <w:rFonts w:ascii="Times New Roman" w:hAnsi="Times New Roman" w:cs="Times New Roman"/>
+          <w:b/>
+          <w:bCs/>
+          <w:sz w:val="32"/>
+          <w:szCs w:val="32"/>
+        </w:rPr>
+        <w:t>.</w:t>
+      </w:r>
+      <w:r>
+        <w:rPr>
+          <w:rFonts w:ascii="Times New Roman" w:hAnsi="Times New Roman" w:cs="Times New Roman"/>
+          <w:b/>
+          <w:bCs/>
+          <w:sz w:val="32"/>
+          <w:szCs w:val="32"/>
+        </w:rPr>
+        <w:t xml:space="preserve"> Use </w:t>
+      </w:r>
+      <w:r>
+        <w:rPr>
+          <w:rFonts w:ascii="Times New Roman" w:hAnsi="Times New Roman" w:cs="Times New Roman"/>
+          <w:b/>
+          <w:bCs/>
+          <w:sz w:val="32"/>
+          <w:szCs w:val="32"/>
+        </w:rPr>
+        <w:t>‘</w:t>
+      </w:r>
+      <w:r>
+        <w:rPr>
+          <w:rFonts w:ascii="Times New Roman" w:hAnsi="Times New Roman" w:cs="Times New Roman"/>
+          <w:b/>
+          <w:bCs/>
+          <w:sz w:val="32"/>
+          <w:szCs w:val="32"/>
+        </w:rPr>
+        <w:t>have</w:t>
+      </w:r>
+      <w:r>
+        <w:rPr>
+          <w:rFonts w:ascii="Times New Roman" w:hAnsi="Times New Roman" w:cs="Times New Roman"/>
+          <w:b/>
+          <w:bCs/>
+          <w:sz w:val="32"/>
+          <w:szCs w:val="32"/>
+        </w:rPr>
+        <w:t>’</w:t>
+      </w:r>
+      <w:r>
+        <w:rPr>
+          <w:rFonts w:ascii="Times New Roman" w:hAnsi="Times New Roman" w:cs="Times New Roman"/>
+          <w:b/>
+          <w:bCs/>
+          <w:sz w:val="32"/>
+          <w:szCs w:val="32"/>
+        </w:rPr>
+        <w:t xml:space="preserve"> or </w:t>
+      </w:r>
+      <w:r>
+        <w:rPr>
+          <w:rFonts w:ascii="Times New Roman" w:hAnsi="Times New Roman" w:cs="Times New Roman"/>
+          <w:b/>
+          <w:bCs/>
+          <w:sz w:val="32"/>
+          <w:szCs w:val="32"/>
+        </w:rPr>
+        <w:t>‘</w:t>
+      </w:r>
+      <w:r>
+        <w:rPr>
+          <w:rFonts w:ascii="Times New Roman" w:hAnsi="Times New Roman" w:cs="Times New Roman"/>
+          <w:b/>
+          <w:bCs/>
+          <w:sz w:val="32"/>
+          <w:szCs w:val="32"/>
+        </w:rPr>
+        <w:t>has</w:t>
+      </w:r>
+      <w:r>
+        <w:rPr>
+          <w:rFonts w:ascii="Times New Roman" w:hAnsi="Times New Roman" w:cs="Times New Roman"/>
+          <w:b/>
+          <w:bCs/>
+          <w:sz w:val="32"/>
+          <w:szCs w:val="32"/>
+        </w:rPr>
+        <w:t>’</w:t>
+      </w:r>
+      <w:r>
+        <w:rPr>
+          <w:rFonts w:ascii="Times New Roman" w:hAnsi="Times New Roman" w:cs="Times New Roman"/>
+          <w:b/>
+          <w:bCs/>
+          <w:sz w:val="32"/>
+          <w:szCs w:val="32"/>
+        </w:rPr>
+        <w:t>.</w:t>
       </w:r>
       <w:r>
         <w:rPr>
@@ -2359,7 +2479,107 @@
           <w:sz w:val="32"/>
           <w:szCs w:val="32"/>
         </w:rPr>
-        <w:t>Q.N. 6, Join these sentences using "and" or "but".</w:t>
+        <w:t>Q.N. 6</w:t>
+      </w:r>
+      <w:r>
+        <w:rPr>
+          <w:rFonts w:ascii="Times New Roman" w:hAnsi="Times New Roman" w:cs="Times New Roman"/>
+          <w:b/>
+          <w:bCs/>
+          <w:sz w:val="32"/>
+          <w:szCs w:val="32"/>
+        </w:rPr>
+        <w:t>.</w:t>
+      </w:r>
+      <w:r>
+        <w:rPr>
+          <w:rFonts w:ascii="Times New Roman" w:hAnsi="Times New Roman" w:cs="Times New Roman"/>
+          <w:b/>
+          <w:bCs/>
+          <w:sz w:val="32"/>
+          <w:szCs w:val="32"/>
+        </w:rPr>
+        <w:t xml:space="preserve"> Join these sentences using </w:t>
+      </w:r>
+      <w:r>
+        <w:rPr>
+          <w:rFonts w:ascii="Times New Roman" w:hAnsi="Times New Roman" w:cs="Times New Roman"/>
+          <w:b/>
+          <w:bCs/>
+          <w:sz w:val="32"/>
+          <w:szCs w:val="32"/>
+        </w:rPr>
+        <w:t>‘</w:t>
+      </w:r>
+      <w:r>
+        <w:rPr>
+          <w:rFonts w:ascii="Times New Roman" w:hAnsi="Times New Roman" w:cs="Times New Roman"/>
+          <w:b/>
+          <w:bCs/>
+          <w:sz w:val="32"/>
+          <w:szCs w:val="32"/>
+        </w:rPr>
+        <w:t>and</w:t>
+      </w:r>
+      <w:r>
+        <w:rPr>
+          <w:rFonts w:ascii="Times New Roman" w:hAnsi="Times New Roman" w:cs="Times New Roman"/>
+          <w:b/>
+          <w:bCs/>
+          <w:sz w:val="32"/>
+          <w:szCs w:val="32"/>
+        </w:rPr>
+        <w:t>’</w:t>
+      </w:r>
+      <w:r>
+        <w:rPr>
+          <w:rFonts w:ascii="Times New Roman" w:hAnsi="Times New Roman" w:cs="Times New Roman"/>
+          <w:b/>
+          <w:bCs/>
+          <w:sz w:val="32"/>
+          <w:szCs w:val="32"/>
+        </w:rPr>
+        <w:t xml:space="preserve"> or </w:t>
+      </w:r>
+      <w:r>
+        <w:rPr>
+          <w:rFonts w:ascii="Times New Roman" w:hAnsi="Times New Roman" w:cs="Times New Roman"/>
+          <w:b/>
+          <w:bCs/>
+          <w:sz w:val="32"/>
+          <w:szCs w:val="32"/>
+        </w:rPr>
+        <w:t>‘</w:t>
+      </w:r>
+      <w:r>
+        <w:rPr>
+          <w:rFonts w:ascii="Times New Roman" w:hAnsi="Times New Roman" w:cs="Times New Roman"/>
+          <w:b/>
+          <w:bCs/>
+          <w:sz w:val="32"/>
+          <w:szCs w:val="32"/>
+        </w:rPr>
+        <w:t>but</w:t>
+      </w:r>
+      <w:r>
+        <w:rPr>
+          <w:rFonts w:ascii="Times New Roman" w:hAnsi="Times New Roman" w:cs="Times New Roman"/>
+          <w:b/>
+          <w:bCs/>
+          <w:sz w:val="32"/>
+          <w:szCs w:val="32"/>
+        </w:rPr>
+        <w:t>’</w:t>
+      </w:r>
+      <w:r>
+        <w:rPr>
+          <w:rFonts w:ascii="Times New Roman" w:hAnsi="Times New Roman" w:cs="Times New Roman"/>
+          <w:b/>
+          <w:bCs/>
+          <w:sz w:val="32"/>
+          <w:szCs w:val="32"/>
+        </w:rPr>
+        <w:t>.</w:t>
       </w:r>
       <w:r>
         <w:rPr>
@@ -2453,7 +2673,39 @@
           <w:sz w:val="32"/>
           <w:szCs w:val="32"/>
         </w:rPr>
-        <w:t xml:space="preserve"> Boys are tall, girls are short.</w:t>
+        <w:t xml:space="preserve"> Boys are tall</w:t>
+      </w:r>
+      <w:r>
+        <w:rPr>
+          <w:rFonts w:ascii="Times New Roman" w:hAnsi="Times New Roman" w:cs="Times New Roman"/>
+          <w:sz w:val="32"/>
+          <w:szCs w:val="32"/>
+        </w:rPr>
+        <w:t>:</w:t>
+      </w:r>
+      <w:r>
+        <w:rPr>
+          <w:rFonts w:ascii="Times New Roman" w:hAnsi="Times New Roman" w:cs="Times New Roman"/>
+          <w:sz w:val="32"/>
+          <w:szCs w:val="32"/>
+        </w:rPr>
+        <w:t xml:space="preserve"> </w:t>
+      </w:r>
+      <w:r>
+        <w:rPr>
+          <w:rFonts w:ascii="Times New Roman" w:hAnsi="Times New Roman" w:cs="Times New Roman"/>
+          <w:sz w:val="32"/>
+          <w:szCs w:val="32"/>
+        </w:rPr>
+        <w:t>G</w:t>
+      </w:r>
+      <w:r>
+        <w:rPr>
+          <w:rFonts w:ascii="Times New Roman" w:hAnsi="Times New Roman" w:cs="Times New Roman"/>
+          <w:sz w:val="32"/>
+          <w:szCs w:val="32"/>
+        </w:rPr>
+        <w:t>irls are short.</w:t>
       </w:r>
     </w:p>
     <w:p>
@@ -2497,29 +2749,400 @@
           <w:sz w:val="32"/>
           <w:szCs w:val="32"/>
         </w:rPr>
+        <w:t>b</w:t>
+      </w:r>
+      <w:r>
+        <w:rPr>
+          <w:rFonts w:ascii="Times New Roman" w:hAnsi="Times New Roman" w:cs="Times New Roman"/>
+          <w:sz w:val="32"/>
+          <w:szCs w:val="32"/>
+        </w:rPr>
+        <w:t>.</w:t>
+      </w:r>
+      <w:r>
+        <w:rPr>
+          <w:rFonts w:ascii="Times New Roman" w:hAnsi="Times New Roman" w:cs="Times New Roman"/>
+          <w:sz w:val="32"/>
+          <w:szCs w:val="32"/>
+        </w:rPr>
+        <w:t xml:space="preserve"> Surya was tall, </w:t>
+      </w:r>
+      <w:r>
+        <w:rPr>
+          <w:rFonts w:ascii="Times New Roman" w:hAnsi="Times New Roman" w:cs="Times New Roman"/>
+          <w:sz w:val="32"/>
+          <w:szCs w:val="32"/>
+        </w:rPr>
+        <w:t>Surya</w:t>
+      </w:r>
+      <w:r>
+        <w:rPr>
+          <w:rFonts w:ascii="Times New Roman" w:hAnsi="Times New Roman" w:cs="Times New Roman"/>
+          <w:sz w:val="32"/>
+          <w:szCs w:val="32"/>
+        </w:rPr>
+        <w:t xml:space="preserve"> was handsome.</w:t>
+      </w:r>
+    </w:p>
+    <w:p>
+      <w:pPr>
+        <w:spacing w:after="80" w:line="360" w:lineRule="auto"/>
+        <w:rPr>
+          <w:rFonts w:ascii="Times New Roman" w:hAnsi="Times New Roman" w:cs="Times New Roman"/>
+          <w:sz w:val="32"/>
+          <w:szCs w:val="32"/>
+        </w:rPr>
+      </w:pPr>
+      <w:r>
+        <w:rPr>
+          <w:rFonts w:ascii="Times New Roman" w:hAnsi="Times New Roman" w:cs="Times New Roman"/>
+          <w:sz w:val="32"/>
+          <w:szCs w:val="32"/>
+        </w:rPr>
+        <w:t>Ans _______________________</w:t>
+      </w:r>
+    </w:p>
+    <w:p>
+      <w:pPr>
+        <w:spacing w:after="80" w:line="240" w:lineRule="auto"/>
+        <w:rPr>
+          <w:rFonts w:ascii="Times New Roman" w:hAnsi="Times New Roman" w:cs="Times New Roman"/>
+          <w:sz w:val="32"/>
+          <w:szCs w:val="32"/>
+        </w:rPr>
+      </w:pPr>
+    </w:p>
+    <w:p>
+      <w:pPr>
+        <w:spacing w:after="80" w:line="240" w:lineRule="auto"/>
+        <w:rPr>
+          <w:rFonts w:ascii="Times New Roman" w:hAnsi="Times New Roman" w:cs="Times New Roman"/>
+          <w:b/>
+          <w:bCs/>
+          <w:sz w:val="32"/>
+          <w:szCs w:val="32"/>
+        </w:rPr>
+      </w:pPr>
+      <w:r>
+        <w:rPr>
+          <w:rFonts w:ascii="Times New Roman" w:hAnsi="Times New Roman" w:cs="Times New Roman"/>
+          <w:b/>
+          <w:bCs/>
+          <w:sz w:val="32"/>
+          <w:szCs w:val="32"/>
+        </w:rPr>
+        <w:t>Q.N.7</w:t>
+      </w:r>
+      <w:r>
+        <w:rPr>
+          <w:rFonts w:ascii="Times New Roman" w:hAnsi="Times New Roman" w:cs="Times New Roman"/>
+          <w:b/>
+          <w:bCs/>
+          <w:sz w:val="32"/>
+          <w:szCs w:val="32"/>
+        </w:rPr>
+        <w:t>.</w:t>
+      </w:r>
+      <w:r>
+        <w:rPr>
+          <w:rFonts w:ascii="Times New Roman" w:hAnsi="Times New Roman" w:cs="Times New Roman"/>
+          <w:b/>
+          <w:bCs/>
+          <w:sz w:val="32"/>
+          <w:szCs w:val="32"/>
+        </w:rPr>
+        <w:t xml:space="preserve"> Change the sentence into </w:t>
+      </w:r>
+      <w:r>
+        <w:rPr>
+          <w:rFonts w:ascii="Times New Roman" w:hAnsi="Times New Roman" w:cs="Times New Roman"/>
+          <w:b/>
+          <w:bCs/>
+          <w:sz w:val="32"/>
+          <w:szCs w:val="32"/>
+        </w:rPr>
+        <w:t>n</w:t>
+      </w:r>
+      <w:r>
+        <w:rPr>
+          <w:rFonts w:ascii="Times New Roman" w:hAnsi="Times New Roman" w:cs="Times New Roman"/>
+          <w:b/>
+          <w:bCs/>
+          <w:sz w:val="32"/>
+          <w:szCs w:val="32"/>
+        </w:rPr>
+        <w:t>egative.</w:t>
+      </w:r>
+      <w:r>
+        <w:rPr>
+          <w:rFonts w:ascii="Times New Roman" w:hAnsi="Times New Roman" w:cs="Times New Roman"/>
+          <w:b/>
+          <w:bCs/>
+          <w:sz w:val="32"/>
+          <w:szCs w:val="32"/>
+        </w:rPr>
+        <w:tab/>
+      </w:r>
+      <w:r>
+        <w:rPr>
+          <w:rFonts w:ascii="Times New Roman" w:hAnsi="Times New Roman" w:cs="Times New Roman"/>
+          <w:b/>
+          <w:bCs/>
+          <w:sz w:val="32"/>
+          <w:szCs w:val="32"/>
+        </w:rPr>
+        <w:tab/>
+      </w:r>
+      <w:r>
+        <w:rPr>
+          <w:rFonts w:ascii="Times New Roman" w:hAnsi="Times New Roman" w:cs="Times New Roman"/>
+          <w:b/>
+          <w:bCs/>
+          <w:sz w:val="32"/>
+          <w:szCs w:val="32"/>
+        </w:rPr>
+        <w:tab/>
+      </w:r>
+      <w:r>
+        <w:rPr>
+          <w:rFonts w:ascii="Times New Roman" w:hAnsi="Times New Roman" w:cs="Times New Roman"/>
+          <w:b/>
+          <w:bCs/>
+          <w:sz w:val="32"/>
+          <w:szCs w:val="32"/>
+        </w:rPr>
+        <w:tab/>
+      </w:r>
+      <w:r>
+        <w:rPr>
+          <w:rFonts w:ascii="Times New Roman" w:hAnsi="Times New Roman" w:cs="Times New Roman"/>
+          <w:b/>
+          <w:bCs/>
+          <w:sz w:val="32"/>
+          <w:szCs w:val="32"/>
+        </w:rPr>
+        <w:tab/>
+      </w:r>
+      <w:r>
+        <w:rPr>
+          <w:rFonts w:ascii="Times New Roman" w:hAnsi="Times New Roman" w:cs="Times New Roman"/>
+          <w:b/>
+          <w:bCs/>
+          <w:sz w:val="32"/>
+          <w:szCs w:val="32"/>
+        </w:rPr>
+        <w:tab/>
+      </w:r>
+      <w:r>
+        <w:rPr>
+          <w:rFonts w:ascii="Times New Roman" w:hAnsi="Times New Roman" w:cs="Times New Roman"/>
+          <w:b/>
+          <w:bCs/>
+          <w:sz w:val="32"/>
+          <w:szCs w:val="32"/>
+        </w:rPr>
+        <w:tab/>
+        <w:t>3</w:t>
+      </w:r>
+    </w:p>
+    <w:p>
+      <w:pPr>
+        <w:spacing w:after="80" w:line="360" w:lineRule="auto"/>
+        <w:rPr>
+          <w:rFonts w:ascii="Times New Roman" w:hAnsi="Times New Roman" w:cs="Times New Roman"/>
+          <w:sz w:val="32"/>
+          <w:szCs w:val="32"/>
+        </w:rPr>
+      </w:pPr>
+      <w:r>
+        <w:rPr>
+          <w:rFonts w:ascii="Times New Roman" w:hAnsi="Times New Roman" w:cs="Times New Roman"/>
+          <w:sz w:val="32"/>
+          <w:szCs w:val="32"/>
+        </w:rPr>
+        <w:t>a</w:t>
+      </w:r>
+      <w:r>
+        <w:rPr>
+          <w:rFonts w:ascii="Times New Roman" w:hAnsi="Times New Roman" w:cs="Times New Roman"/>
+          <w:sz w:val="32"/>
+          <w:szCs w:val="32"/>
+        </w:rPr>
+        <w:t>.</w:t>
+      </w:r>
+      <w:r>
+        <w:rPr>
+          <w:rFonts w:ascii="Times New Roman" w:hAnsi="Times New Roman" w:cs="Times New Roman"/>
+          <w:sz w:val="32"/>
+          <w:szCs w:val="32"/>
+        </w:rPr>
+        <w:t xml:space="preserve"> It is a book.</w:t>
+      </w:r>
+    </w:p>
+    <w:p>
+      <w:pPr>
+        <w:spacing w:after="80" w:line="360" w:lineRule="auto"/>
+        <w:rPr>
+          <w:rFonts w:ascii="Times New Roman" w:hAnsi="Times New Roman" w:cs="Times New Roman"/>
+          <w:sz w:val="32"/>
+          <w:szCs w:val="32"/>
+        </w:rPr>
+      </w:pPr>
+      <w:r>
+        <w:rPr>
+          <w:rFonts w:ascii="Times New Roman" w:hAnsi="Times New Roman" w:cs="Times New Roman"/>
+          <w:sz w:val="32"/>
+          <w:szCs w:val="32"/>
+        </w:rPr>
+        <w:t>Ans</w:t>
+      </w:r>
+      <w:r>
+        <w:rPr>
+          <w:rFonts w:ascii="Times New Roman" w:hAnsi="Times New Roman" w:cs="Times New Roman"/>
+          <w:sz w:val="32"/>
+          <w:szCs w:val="32"/>
+        </w:rPr>
+        <w:t>: _______________________</w:t>
+      </w:r>
+    </w:p>
+    <w:p>
+      <w:pPr>
+        <w:spacing w:after="80" w:line="360" w:lineRule="auto"/>
+        <w:rPr>
+          <w:rFonts w:ascii="Times New Roman" w:hAnsi="Times New Roman" w:cs="Times New Roman"/>
+          <w:sz w:val="32"/>
+          <w:szCs w:val="32"/>
+        </w:rPr>
+      </w:pPr>
+      <w:r>
+        <w:rPr>
+          <w:rFonts w:ascii="Times New Roman" w:hAnsi="Times New Roman" w:cs="Times New Roman"/>
+          <w:sz w:val="32"/>
+          <w:szCs w:val="32"/>
+        </w:rPr>
+        <w:t>b</w:t>
+      </w:r>
+      <w:r>
+        <w:rPr>
+          <w:rFonts w:ascii="Times New Roman" w:hAnsi="Times New Roman" w:cs="Times New Roman"/>
+          <w:sz w:val="32"/>
+          <w:szCs w:val="32"/>
+        </w:rPr>
+        <w:t>.</w:t>
+      </w:r>
+      <w:r>
+        <w:rPr>
+          <w:rFonts w:ascii="Times New Roman" w:hAnsi="Times New Roman" w:cs="Times New Roman"/>
+          <w:sz w:val="32"/>
+          <w:szCs w:val="32"/>
+        </w:rPr>
+        <w:t xml:space="preserve"> He was </w:t>
+      </w:r>
+      <w:r>
+        <w:rPr>
+          <w:rFonts w:ascii="Times New Roman" w:hAnsi="Times New Roman" w:cs="Times New Roman"/>
+          <w:sz w:val="32"/>
+          <w:szCs w:val="32"/>
+        </w:rPr>
+        <w:t>sleeping</w:t>
+      </w:r>
+      <w:r>
+        <w:rPr>
+          <w:rFonts w:ascii="Times New Roman" w:hAnsi="Times New Roman" w:cs="Times New Roman"/>
+          <w:sz w:val="32"/>
+          <w:szCs w:val="32"/>
+        </w:rPr>
+        <w:t>.</w:t>
+      </w:r>
+    </w:p>
+    <w:p>
+      <w:pPr>
+        <w:spacing w:after="80" w:line="360" w:lineRule="auto"/>
+        <w:rPr>
+          <w:rFonts w:ascii="Times New Roman" w:hAnsi="Times New Roman" w:cs="Times New Roman"/>
+          <w:sz w:val="32"/>
+          <w:szCs w:val="32"/>
+        </w:rPr>
+      </w:pPr>
+      <w:r>
+        <w:rPr>
+          <w:rFonts w:ascii="Times New Roman" w:hAnsi="Times New Roman" w:cs="Times New Roman"/>
+          <w:sz w:val="32"/>
+          <w:szCs w:val="32"/>
+        </w:rPr>
+        <w:t>Ans</w:t>
+      </w:r>
+      <w:r>
+        <w:rPr>
+          <w:rFonts w:ascii="Times New Roman" w:hAnsi="Times New Roman" w:cs="Times New Roman"/>
+          <w:sz w:val="32"/>
+          <w:szCs w:val="32"/>
+        </w:rPr>
+        <w:t>: _______________________</w:t>
+      </w:r>
+    </w:p>
+    <w:p>
+      <w:pPr>
+        <w:spacing w:after="80" w:line="360" w:lineRule="auto"/>
+        <w:rPr>
+          <w:rFonts w:ascii="Times New Roman" w:hAnsi="Times New Roman" w:cs="Times New Roman"/>
+          <w:sz w:val="32"/>
+          <w:szCs w:val="32"/>
+        </w:rPr>
+      </w:pPr>
+      <w:r>
+        <w:rPr>
+          <w:rFonts w:ascii="Times New Roman" w:hAnsi="Times New Roman" w:cs="Times New Roman"/>
+          <w:sz w:val="32"/>
+          <w:szCs w:val="32"/>
+        </w:rPr>
+        <w:t>c. They are playing.</w:t>
+      </w:r>
+    </w:p>
+    <w:p>
+      <w:pPr>
+        <w:spacing w:after="80" w:line="360" w:lineRule="auto"/>
+        <w:rPr>
+          <w:rFonts w:ascii="Times New Roman" w:hAnsi="Times New Roman" w:cs="Times New Roman"/>
+          <w:sz w:val="32"/>
+          <w:szCs w:val="32"/>
+        </w:rPr>
+      </w:pPr>
+      <w:r>
+        <w:rPr>
+          <w:rFonts w:ascii="Times New Roman" w:hAnsi="Times New Roman" w:cs="Times New Roman"/>
+          <w:sz w:val="32"/>
+          <w:szCs w:val="32"/>
+        </w:rPr>
         <w:t>Ans: _______________________</w:t>
       </w:r>
     </w:p>
     <w:p>
       <w:pPr>
-        <w:spacing w:after="80" w:line="360" w:lineRule="auto"/>
-        <w:rPr>
-          <w:rFonts w:ascii="Times New Roman" w:hAnsi="Times New Roman" w:cs="Times New Roman"/>
-          <w:sz w:val="32"/>
-          <w:szCs w:val="32"/>
-        </w:rPr>
-      </w:pPr>
-      <w:r>
-        <w:rPr>
-          <w:rFonts w:ascii="Times New Roman" w:hAnsi="Times New Roman" w:cs="Times New Roman"/>
-          <w:sz w:val="32"/>
-          <w:szCs w:val="32"/>
-        </w:rPr>
-        <w:t>b</w:t>
-      </w:r>
-      <w:r>
-        <w:rPr>
-          <w:rFonts w:ascii="Times New Roman" w:hAnsi="Times New Roman" w:cs="Times New Roman"/>
+        <w:spacing w:after="80" w:line="240" w:lineRule="auto"/>
+        <w:rPr>
+          <w:rFonts w:ascii="Times New Roman" w:hAnsi="Times New Roman" w:cs="Times New Roman"/>
+          <w:b/>
+          <w:bCs/>
+          <w:sz w:val="32"/>
+          <w:szCs w:val="32"/>
+        </w:rPr>
+      </w:pPr>
+      <w:r>
+        <w:rPr>
+          <w:rFonts w:ascii="Times New Roman" w:hAnsi="Times New Roman" w:cs="Times New Roman"/>
+          <w:b/>
+          <w:bCs/>
+          <w:sz w:val="32"/>
+          <w:szCs w:val="32"/>
+        </w:rPr>
+        <w:t>Q.N. 8</w:t>
+      </w:r>
+      <w:r>
+        <w:rPr>
+          <w:rFonts w:ascii="Times New Roman" w:hAnsi="Times New Roman" w:cs="Times New Roman"/>
+          <w:b/>
+          <w:bCs/>
           <w:sz w:val="32"/>
           <w:szCs w:val="32"/>
         </w:rPr>
@@ -2528,298 +3151,12 @@
       <w:r>
         <w:rPr>
           <w:rFonts w:ascii="Times New Roman" w:hAnsi="Times New Roman" w:cs="Times New Roman"/>
-          <w:sz w:val="32"/>
-          <w:szCs w:val="32"/>
-        </w:rPr>
-        <w:t xml:space="preserve"> Surya was tall, </w:t>
-      </w:r>
-      <w:proofErr w:type="spellStart"/>
-      <w:r>
-        <w:rPr>
-          <w:rFonts w:ascii="Times New Roman" w:hAnsi="Times New Roman" w:cs="Times New Roman"/>
-          <w:sz w:val="32"/>
-          <w:szCs w:val="32"/>
-        </w:rPr>
-        <w:t>surya</w:t>
-      </w:r>
-      <w:proofErr w:type="spellEnd"/>
-      <w:r>
-        <w:rPr>
-          <w:rFonts w:ascii="Times New Roman" w:hAnsi="Times New Roman" w:cs="Times New Roman"/>
-          <w:sz w:val="32"/>
-          <w:szCs w:val="32"/>
-        </w:rPr>
-        <w:t xml:space="preserve"> was handsome.</w:t>
-      </w:r>
-    </w:p>
-    <w:p>
-      <w:pPr>
-        <w:spacing w:after="80" w:line="360" w:lineRule="auto"/>
-        <w:rPr>
-          <w:rFonts w:ascii="Times New Roman" w:hAnsi="Times New Roman" w:cs="Times New Roman"/>
-          <w:sz w:val="32"/>
-          <w:szCs w:val="32"/>
-        </w:rPr>
-      </w:pPr>
-      <w:r>
-        <w:rPr>
-          <w:rFonts w:ascii="Times New Roman" w:hAnsi="Times New Roman" w:cs="Times New Roman"/>
-          <w:sz w:val="32"/>
-          <w:szCs w:val="32"/>
-        </w:rPr>
-        <w:t>Ans _______________________</w:t>
-      </w:r>
-    </w:p>
-    <w:p>
-      <w:pPr>
-        <w:spacing w:after="80" w:line="240" w:lineRule="auto"/>
-        <w:rPr>
-          <w:rFonts w:ascii="Times New Roman" w:hAnsi="Times New Roman" w:cs="Times New Roman"/>
-          <w:sz w:val="32"/>
-          <w:szCs w:val="32"/>
-        </w:rPr>
-      </w:pPr>
-    </w:p>
-    <w:p>
-      <w:pPr>
-        <w:spacing w:after="80" w:line="240" w:lineRule="auto"/>
-        <w:rPr>
-          <w:rFonts w:ascii="Times New Roman" w:hAnsi="Times New Roman" w:cs="Times New Roman"/>
-          <w:b/>
-          <w:bCs/>
-          <w:sz w:val="32"/>
-          <w:szCs w:val="32"/>
-        </w:rPr>
-      </w:pPr>
-      <w:r>
-        <w:rPr>
-          <w:rFonts w:ascii="Times New Roman" w:hAnsi="Times New Roman" w:cs="Times New Roman"/>
-          <w:b/>
-          <w:bCs/>
-          <w:sz w:val="32"/>
-          <w:szCs w:val="32"/>
-        </w:rPr>
-        <w:t>Q.N.7, Change the sentence in to Negative.</w:t>
-      </w:r>
-      <w:r>
-        <w:rPr>
-          <w:rFonts w:ascii="Times New Roman" w:hAnsi="Times New Roman" w:cs="Times New Roman"/>
-          <w:b/>
-          <w:bCs/>
-          <w:sz w:val="32"/>
-          <w:szCs w:val="32"/>
-        </w:rPr>
-        <w:tab/>
-      </w:r>
-      <w:r>
-        <w:rPr>
-          <w:rFonts w:ascii="Times New Roman" w:hAnsi="Times New Roman" w:cs="Times New Roman"/>
-          <w:b/>
-          <w:bCs/>
-          <w:sz w:val="32"/>
-          <w:szCs w:val="32"/>
-        </w:rPr>
-        <w:tab/>
-      </w:r>
-      <w:r>
-        <w:rPr>
-          <w:rFonts w:ascii="Times New Roman" w:hAnsi="Times New Roman" w:cs="Times New Roman"/>
-          <w:b/>
-          <w:bCs/>
-          <w:sz w:val="32"/>
-          <w:szCs w:val="32"/>
-        </w:rPr>
-        <w:tab/>
-      </w:r>
-      <w:r>
-        <w:rPr>
-          <w:rFonts w:ascii="Times New Roman" w:hAnsi="Times New Roman" w:cs="Times New Roman"/>
-          <w:b/>
-          <w:bCs/>
-          <w:sz w:val="32"/>
-          <w:szCs w:val="32"/>
-        </w:rPr>
-        <w:tab/>
-      </w:r>
-      <w:r>
-        <w:rPr>
-          <w:rFonts w:ascii="Times New Roman" w:hAnsi="Times New Roman" w:cs="Times New Roman"/>
-          <w:b/>
-          <w:bCs/>
-          <w:sz w:val="32"/>
-          <w:szCs w:val="32"/>
-        </w:rPr>
-        <w:tab/>
-      </w:r>
-      <w:r>
-        <w:rPr>
-          <w:rFonts w:ascii="Times New Roman" w:hAnsi="Times New Roman" w:cs="Times New Roman"/>
-          <w:b/>
-          <w:bCs/>
-          <w:sz w:val="32"/>
-          <w:szCs w:val="32"/>
-        </w:rPr>
-        <w:t>1.5 +1.5</w:t>
-      </w:r>
-    </w:p>
-    <w:p>
-      <w:pPr>
-        <w:spacing w:after="80" w:line="360" w:lineRule="auto"/>
-        <w:rPr>
-          <w:rFonts w:ascii="Times New Roman" w:hAnsi="Times New Roman" w:cs="Times New Roman"/>
-          <w:sz w:val="32"/>
-          <w:szCs w:val="32"/>
-        </w:rPr>
-      </w:pPr>
-      <w:r>
-        <w:rPr>
-          <w:rFonts w:ascii="Times New Roman" w:hAnsi="Times New Roman" w:cs="Times New Roman"/>
-          <w:sz w:val="32"/>
-          <w:szCs w:val="32"/>
-        </w:rPr>
-        <w:t>a</w:t>
-      </w:r>
-      <w:r>
-        <w:rPr>
-          <w:rFonts w:ascii="Times New Roman" w:hAnsi="Times New Roman" w:cs="Times New Roman"/>
-          <w:sz w:val="32"/>
-          <w:szCs w:val="32"/>
-        </w:rPr>
-        <w:t>.</w:t>
-      </w:r>
-      <w:r>
-        <w:rPr>
-          <w:rFonts w:ascii="Times New Roman" w:hAnsi="Times New Roman" w:cs="Times New Roman"/>
-          <w:sz w:val="32"/>
-          <w:szCs w:val="32"/>
-        </w:rPr>
-        <w:t xml:space="preserve"> It is a book.</w:t>
-      </w:r>
-    </w:p>
-    <w:p>
-      <w:pPr>
-        <w:spacing w:after="80" w:line="360" w:lineRule="auto"/>
-        <w:rPr>
-          <w:rFonts w:ascii="Times New Roman" w:hAnsi="Times New Roman" w:cs="Times New Roman"/>
-          <w:sz w:val="32"/>
-          <w:szCs w:val="32"/>
-        </w:rPr>
-      </w:pPr>
-      <w:r>
-        <w:rPr>
-          <w:rFonts w:ascii="Times New Roman" w:hAnsi="Times New Roman" w:cs="Times New Roman"/>
-          <w:sz w:val="32"/>
-          <w:szCs w:val="32"/>
-        </w:rPr>
-        <w:t>Ans</w:t>
-      </w:r>
-      <w:r>
-        <w:rPr>
-          <w:rFonts w:ascii="Times New Roman" w:hAnsi="Times New Roman" w:cs="Times New Roman"/>
-          <w:sz w:val="32"/>
-          <w:szCs w:val="32"/>
-        </w:rPr>
-        <w:t>: _______________________</w:t>
-      </w:r>
-    </w:p>
-    <w:p>
-      <w:pPr>
-        <w:spacing w:after="80" w:line="360" w:lineRule="auto"/>
-        <w:rPr>
-          <w:rFonts w:ascii="Times New Roman" w:hAnsi="Times New Roman" w:cs="Times New Roman"/>
-          <w:sz w:val="32"/>
-          <w:szCs w:val="32"/>
-        </w:rPr>
-      </w:pPr>
-      <w:r>
-        <w:rPr>
-          <w:rFonts w:ascii="Times New Roman" w:hAnsi="Times New Roman" w:cs="Times New Roman"/>
-          <w:sz w:val="32"/>
-          <w:szCs w:val="32"/>
-        </w:rPr>
-        <w:t>b</w:t>
-      </w:r>
-      <w:r>
-        <w:rPr>
-          <w:rFonts w:ascii="Times New Roman" w:hAnsi="Times New Roman" w:cs="Times New Roman"/>
-          <w:sz w:val="32"/>
-          <w:szCs w:val="32"/>
-        </w:rPr>
-        <w:t>.</w:t>
-      </w:r>
-      <w:r>
-        <w:rPr>
-          <w:rFonts w:ascii="Times New Roman" w:hAnsi="Times New Roman" w:cs="Times New Roman"/>
-          <w:sz w:val="32"/>
-          <w:szCs w:val="32"/>
-        </w:rPr>
-        <w:t xml:space="preserve"> He was </w:t>
-      </w:r>
-      <w:proofErr w:type="spellStart"/>
-      <w:r>
-        <w:rPr>
-          <w:rFonts w:ascii="Times New Roman" w:hAnsi="Times New Roman" w:cs="Times New Roman"/>
-          <w:sz w:val="32"/>
-          <w:szCs w:val="32"/>
-        </w:rPr>
-        <w:t>sleeeping</w:t>
-      </w:r>
-      <w:proofErr w:type="spellEnd"/>
-      <w:r>
-        <w:rPr>
-          <w:rFonts w:ascii="Times New Roman" w:hAnsi="Times New Roman" w:cs="Times New Roman"/>
-          <w:sz w:val="32"/>
-          <w:szCs w:val="32"/>
-        </w:rPr>
-        <w:t>.</w:t>
-      </w:r>
-    </w:p>
-    <w:p>
-      <w:pPr>
-        <w:spacing w:after="80" w:line="360" w:lineRule="auto"/>
-        <w:rPr>
-          <w:rFonts w:ascii="Times New Roman" w:hAnsi="Times New Roman" w:cs="Times New Roman"/>
-          <w:sz w:val="32"/>
-          <w:szCs w:val="32"/>
-        </w:rPr>
-      </w:pPr>
-      <w:r>
-        <w:rPr>
-          <w:rFonts w:ascii="Times New Roman" w:hAnsi="Times New Roman" w:cs="Times New Roman"/>
-          <w:sz w:val="32"/>
-          <w:szCs w:val="32"/>
-        </w:rPr>
-        <w:t>Ans</w:t>
-      </w:r>
-      <w:r>
-        <w:rPr>
-          <w:rFonts w:ascii="Times New Roman" w:hAnsi="Times New Roman" w:cs="Times New Roman"/>
-          <w:sz w:val="32"/>
-          <w:szCs w:val="32"/>
-        </w:rPr>
-        <w:t>: _______________________</w:t>
-      </w:r>
-    </w:p>
-    <w:p>
-      <w:pPr>
-        <w:spacing w:after="80" w:line="240" w:lineRule="auto"/>
-        <w:rPr>
-          <w:rFonts w:ascii="Times New Roman" w:hAnsi="Times New Roman" w:cs="Times New Roman"/>
-          <w:b/>
-          <w:bCs/>
-          <w:sz w:val="32"/>
-          <w:szCs w:val="32"/>
-        </w:rPr>
-      </w:pPr>
-      <w:r>
-        <w:rPr>
-          <w:rFonts w:ascii="Times New Roman" w:hAnsi="Times New Roman" w:cs="Times New Roman"/>
-          <w:b/>
-          <w:bCs/>
-          <w:sz w:val="32"/>
-          <w:szCs w:val="32"/>
-        </w:rPr>
-        <w:t>Q.N. 8, Answer the questions.</w:t>
+          <w:b/>
+          <w:bCs/>
+          <w:sz w:val="32"/>
+          <w:szCs w:val="32"/>
+        </w:rPr>
+        <w:t xml:space="preserve"> Answer the questions.</w:t>
       </w:r>
       <w:r>
         <w:rPr>
@@ -3473,7 +3810,7 @@
   <w:style w:type="paragraph" w:default="1" w:styleId="Normal">
     <w:name w:val="Normal"/>
     <w:qFormat/>
-    <w:rsid w:val="003E0A69"/>
+    <w:rsid w:val="006A33C0"/>
   </w:style>
   <w:style w:type="character" w:default="1" w:styleId="DefaultParagraphFont">
     <w:name w:val="Default Paragraph Font"/>

</xml_diff>